<commit_message>
Díptico del 11 de octubre: Evangelio corregido (Mt 22, 1-14)
El .docx traía en la sección del Evangelio el texto de la semana anterior
(Mt 21, 33-43) bajo el encabezado de Mt 22, 1-14. Se reemplazó por el
texto de Mt 22, 1-14 en la misma traducción del Leccionario que usan los
dípticos, tanto en el .docx guardado como en los datos de la app.

Co-Authored-By: Claude Sonnet 5.5 <noreply@anthropic.com>
Claude-Session: https://claude.ai/code/session_01BJv7KA5RMvL6p6BNcR9pbZ
</commit_message>
<xml_diff>
--- a/datos/dipticos/2026-10-11.docx
+++ b/datos/dipticos/2026-10-11.docx
@@ -973,7 +973,7 @@
                 <w:sz w:val="24"/>
                 <w:szCs w:val="24"/>
               </w:rPr>
-              <w:t>En aquel tiempo, Jesús dijo a los sumos sacerdotes y a los ancianos del pueblo esta parábola: "Había una vez un propietario que plantó un viñedo, lo rodeó con una cerca, cavó un lagar en él, construyó una torre para el vigilante y luego lo alquiló a unos viñadores y se fue de viaje.</w:t>
+              <w:t xml:space="preserve">En aquel tiempo, volvió Jesús a hablar en parábolas a los sumos sacerdotes y a los ancianos del pueblo, diciendo: "El Reino de los cielos es semejante a un rey que preparó un banquete de bodas para su hijo. Mandó a sus criados que llamaran a los invitados, pero éstos no quisieron ir.</w:t>
             </w:r>
           </w:p>
           <w:p>
@@ -1015,7 +1015,7 @@
                 <w:sz w:val="24"/>
                 <w:szCs w:val="24"/>
               </w:rPr>
-              <w:t>Llegado el tiempo de la vendimia, envió a sus criados para pedir su parte de los frutos a los viñadores; pero éstos se apoderaron de los criados, golpearon a uno, mataron a otro y a otro más lo apedrearon. Envió de nuevo a otros criados, en mayor número que los primeros, y los trataron del mismo modo.</w:t>
+              <w:t xml:space="preserve">Envió de nuevo a otros criados que les dijeran: 'Tengo preparado el banquete; he hecho matar mis terneras y los otros animales gordos; todo está listo. Vengan a la boda'. Pero los invitados no hicieron caso. Uno se fue a su campo, otro a su negocio y los demás se les echaron encima a los criados, los insultaron y los mataron.</w:t>
             </w:r>
           </w:p>
           <w:p>
@@ -1057,7 +1057,7 @@
                 <w:sz w:val="24"/>
                 <w:szCs w:val="24"/>
               </w:rPr>
-              <w:t>Por último, les mandó a su propio hijo, pensando: 'A mi hijo lo respetarán'. Pero cuando los viñadores lo vieron, se dijeron unos a otros: 'Éste es el heredero. Vamos a matarlo y nos quedaremos con su herencia'. Le echaron mano, lo sacaron del viñedo y lo mataron.</w:t>
+              <w:t xml:space="preserve">Entonces el rey se llenó de cólera y mandó sus tropas, que dieron muerte a aquellos asesinos y prendieron fuego a la ciudad.</w:t>
             </w:r>
           </w:p>
           <w:p>
@@ -1099,7 +1099,7 @@
                 <w:sz w:val="24"/>
                 <w:szCs w:val="24"/>
               </w:rPr>
-              <w:t>Ahora, díganme: cuando vuelva el dueño del viñedo, ¿qué hará con esos viñadores?'' Ellos le respondieron: "Dará muerte terrible a esos desalmados y arrendará el viñedo a otros viñadores, que le entreguen los frutos a su tiempo".</w:t>
+              <w:t xml:space="preserve">Luego les dijo a sus criados: 'La boda está preparada; pero los que habían sido invitados no fueron dignos. Salgan, pues, a los cruces de los caminos y conviden al banquete de bodas a todos los que encuentren'. Los criados salieron a los caminos y reunieron a todos los que encontraron, malos y buenos, y la sala del banquete se llenó de convidados.</w:t>
             </w:r>
           </w:p>
           <w:p>
@@ -1141,89 +1141,7 @@
                 <w:sz w:val="24"/>
                 <w:szCs w:val="24"/>
               </w:rPr>
-              <w:t>Entonces Jesús les dijo: "¿No han leído nunca en la Escritura: La piedra que desecharon los constructores, es ahora la piedra angular. Esto es obra del Señor y es un prodigio admirable?</w:t>
-            </w:r>
-          </w:p>
-          <w:p>
-            <w:pPr>
-              <w:pBdr>
-                <w:left w:val="single" w:sz="18" w:space="8" w:color="A67C00"/>
-              </w:pBdr>
-              <w:shd w:val="clear" w:color="auto" w:fill="F4EFE6"/>
-              <w:jc w:val="both"/>
-              <w:rPr>
-                <w:rFonts w:ascii="Arial" w:eastAsia="Georgia" w:hAnsi="Arial" w:cs="Arial"/>
-                <w:i/>
-                <w:iCs/>
-                <w:sz w:val="24"/>
-                <w:szCs w:val="24"/>
-              </w:rPr>
-            </w:pPr>
-          </w:p>
-          <w:p>
-            <w:pPr>
-              <w:pBdr>
-                <w:left w:val="single" w:sz="18" w:space="8" w:color="A67C00"/>
-              </w:pBdr>
-              <w:shd w:val="clear" w:color="auto" w:fill="F4EFE6"/>
-              <w:jc w:val="both"/>
-              <w:rPr>
-                <w:rFonts w:ascii="Arial" w:eastAsia="Georgia" w:hAnsi="Arial" w:cs="Arial"/>
-                <w:b/>
-                <w:bCs/>
-                <w:i/>
-                <w:iCs/>
-                <w:sz w:val="24"/>
-                <w:szCs w:val="24"/>
-              </w:rPr>
-            </w:pPr>
-            <w:r>
-              <w:rPr>
-                <w:rFonts w:ascii="Arial" w:eastAsia="Georgia" w:hAnsi="Arial" w:cs="Arial"/>
-                <w:i/>
-                <w:iCs/>
-                <w:sz w:val="24"/>
-                <w:szCs w:val="24"/>
-              </w:rPr>
-              <w:t>Por esta razón les digo que les será quitado a ustedes el Reino de Dios y se le dará a un pueblo que produzca sus frutos''.</w:t>
-            </w:r>
-            <w:r>
-              <w:rPr>
-                <w:rFonts w:ascii="Arial" w:eastAsia="Georgia" w:hAnsi="Arial" w:cs="Arial"/>
-                <w:b/>
-                <w:bCs/>
-                <w:i/>
-                <w:iCs/>
-                <w:sz w:val="24"/>
-                <w:szCs w:val="24"/>
-              </w:rPr>
-              <w:t xml:space="preserve"> </w:t>
-            </w:r>
-          </w:p>
-          <w:p>
-            <w:pPr>
-              <w:pBdr>
-                <w:left w:val="single" w:sz="18" w:space="8" w:color="A67C00"/>
-              </w:pBdr>
-              <w:shd w:val="clear" w:color="auto" w:fill="F4EFE6"/>
-              <w:jc w:val="both"/>
-              <w:rPr>
-                <w:rFonts w:ascii="Arial" w:eastAsia="Georgia" w:hAnsi="Arial" w:cs="Arial"/>
-                <w:i/>
-                <w:iCs/>
-                <w:sz w:val="24"/>
-                <w:szCs w:val="24"/>
-              </w:rPr>
-            </w:pPr>
-            <w:r>
-              <w:rPr>
-                <w:rFonts w:ascii="Arial" w:eastAsia="Georgia" w:hAnsi="Arial" w:cs="Arial"/>
-                <w:i/>
-                <w:iCs/>
-                <w:sz w:val="24"/>
-                <w:szCs w:val="24"/>
-              </w:rPr>
-              <w:t>.</w:t>
+              <w:t xml:space="preserve">Cuando el rey entró a saludar a los convidados, vio entre ellos a un hombre que no iba vestido con traje de fiesta y le preguntó: 'Amigo, ¿cómo has entrado aquí sin traje de fiesta?' Aquel hombre se quedó callado. Entonces el rey dijo a los criados: 'Átenlo de pies y manos y arrójenlo fuera, a las tinieblas. Allí será el llanto y la desesperación'. Porque muchos son los llamados y pocos los escogidos".</w:t>
             </w:r>
           </w:p>
           <w:p>

</xml_diff>